<commit_message>
add notes re: qualtrics cleaning
</commit_message>
<xml_diff>
--- a/Phase 1/Phase 1 Data Cleaning Notes.docx
+++ b/Phase 1/Phase 1 Data Cleaning Notes.docx
@@ -7,6 +7,168 @@
         <w:pStyle w:val="Heading1"/>
       </w:pPr>
       <w:r>
+        <w:t>Qualtrics Data Cleaning</w:t>
+      </w:r>
+    </w:p>
+    <w:p>
+      <w:pPr>
+        <w:pStyle w:val="Heading2"/>
+      </w:pPr>
+      <w:r>
+        <w:t>Summary</w:t>
+      </w:r>
+    </w:p>
+    <w:p>
+      <w:pPr>
+        <w:pStyle w:val="ListParagraph"/>
+        <w:numPr>
+          <w:ilvl w:val="0"/>
+          <w:numId w:val="2"/>
+        </w:numPr>
+      </w:pPr>
+      <w:r>
+        <w:t>Raw data files are loaded and combined</w:t>
+      </w:r>
+    </w:p>
+    <w:p>
+      <w:pPr>
+        <w:pStyle w:val="ListParagraph"/>
+        <w:numPr>
+          <w:ilvl w:val="0"/>
+          <w:numId w:val="2"/>
+        </w:numPr>
+      </w:pPr>
+      <w:r>
+        <w:t>The item-level codebook is loaded (it will be used for data cleaning)</w:t>
+      </w:r>
+    </w:p>
+    <w:p>
+      <w:pPr>
+        <w:pStyle w:val="ListParagraph"/>
+        <w:numPr>
+          <w:ilvl w:val="0"/>
+          <w:numId w:val="2"/>
+        </w:numPr>
+      </w:pPr>
+      <w:r>
+        <w:t>Invalid responses are removed; in one case, a misspelled ID is fixed</w:t>
+      </w:r>
+    </w:p>
+    <w:p>
+      <w:pPr>
+        <w:pStyle w:val="ListParagraph"/>
+        <w:numPr>
+          <w:ilvl w:val="0"/>
+          <w:numId w:val="2"/>
+        </w:numPr>
+      </w:pPr>
+      <w:r>
+        <w:t>Responses are deduplicated</w:t>
+      </w:r>
+    </w:p>
+    <w:p>
+      <w:pPr>
+        <w:pStyle w:val="ListParagraph"/>
+        <w:numPr>
+          <w:ilvl w:val="0"/>
+          <w:numId w:val="2"/>
+        </w:numPr>
+      </w:pPr>
+      <w:r>
+        <w:t>Baseline and 3m surveys are merged</w:t>
+      </w:r>
+    </w:p>
+    <w:p>
+      <w:pPr>
+        <w:pStyle w:val="ListParagraph"/>
+        <w:numPr>
+          <w:ilvl w:val="0"/>
+          <w:numId w:val="2"/>
+        </w:numPr>
+      </w:pPr>
+      <w:r>
+        <w:t>Columns are cleaned</w:t>
+      </w:r>
+    </w:p>
+    <w:p>
+      <w:pPr>
+        <w:pStyle w:val="ListParagraph"/>
+        <w:numPr>
+          <w:ilvl w:val="1"/>
+          <w:numId w:val="2"/>
+        </w:numPr>
+      </w:pPr>
+      <w:r>
+        <w:t>Reverse-coded items are un-reversed, referring to the codebook to see which items to reverse and how</w:t>
+      </w:r>
+    </w:p>
+    <w:p>
+      <w:pPr>
+        <w:pStyle w:val="ListParagraph"/>
+        <w:numPr>
+          <w:ilvl w:val="1"/>
+          <w:numId w:val="2"/>
+        </w:numPr>
+      </w:pPr>
+      <w:r>
+        <w:t>Scale means are computed, referring to the codebook to see which items go into which scales</w:t>
+      </w:r>
+    </w:p>
+    <w:p>
+      <w:pPr>
+        <w:pStyle w:val="ListParagraph"/>
+        <w:numPr>
+          <w:ilvl w:val="0"/>
+          <w:numId w:val="2"/>
+        </w:numPr>
+      </w:pPr>
+      <w:r>
+        <w:t>LifePak IDs are manually corrected when necessary</w:t>
+      </w:r>
+    </w:p>
+    <w:p>
+      <w:pPr>
+        <w:pStyle w:val="Heading2"/>
+      </w:pPr>
+      <w:r>
+        <w:t>Flags</w:t>
+      </w:r>
+    </w:p>
+    <w:p>
+      <w:pPr>
+        <w:pStyle w:val="ListParagraph"/>
+        <w:numPr>
+          <w:ilvl w:val="0"/>
+          <w:numId w:val="2"/>
+        </w:numPr>
+      </w:pPr>
+      <w:r>
+        <w:t>In the parent-report SCARED, one item (“scared_c_1”) was incorrect in the survey and is not included in mean calculations</w:t>
+      </w:r>
+    </w:p>
+    <w:p>
+      <w:pPr>
+        <w:pStyle w:val="ListParagraph"/>
+        <w:numPr>
+          <w:ilvl w:val="0"/>
+          <w:numId w:val="2"/>
+        </w:numPr>
+      </w:pPr>
+      <w:r>
+        <w:t>Readme_ttt_p1 additionally notes that “</w:t>
+      </w:r>
+      <w:r>
+        <w:t>_scared_c_11 is supposed to be item 39, _scared_c_10 is supposed to be item 41, _scared_c_9 is supposed to be item 40</w:t>
+      </w:r>
+      <w:r>
+        <w:t>” – but I’m not sure what this means or whether it’s a problem</w:t>
+      </w:r>
+    </w:p>
+    <w:p>
+      <w:pPr>
+        <w:pStyle w:val="Heading1"/>
+      </w:pPr>
+      <w:r>
         <w:t>LifePak Data Cleaning</w:t>
       </w:r>
     </w:p>
@@ -174,6 +336,7 @@
         </w:numPr>
       </w:pPr>
       <w:r>
+        <w:lastRenderedPageBreak/>
         <w:t>sad, bad, etc.</w:t>
       </w:r>
       <w:r>
@@ -274,6 +437,9 @@
       <w:r>
         <w:t>Comparison to Michael</w:t>
       </w:r>
+      <w:r>
+        <w:t>’s Data</w:t>
+      </w:r>
     </w:p>
     <w:p>
       <w:pPr>
@@ -353,7 +519,6 @@
         </w:numPr>
       </w:pPr>
       <w:r>
-        <w:lastRenderedPageBreak/>
         <w:t>Michael has a couple of duplicate notifications that I filtered out</w:t>
       </w:r>
     </w:p>
@@ -567,8 +732,123 @@
       </w:rPr>
     </w:lvl>
   </w:abstractNum>
+  <w:abstractNum w:abstractNumId="1" w15:restartNumberingAfterBreak="0">
+    <w:nsid w:val="61EC7404"/>
+    <w:multiLevelType w:val="hybridMultilevel"/>
+    <w:tmpl w:val="EB4A3A52"/>
+    <w:lvl w:ilvl="0" w:tplc="DD70A8B0">
+      <w:numFmt w:val="bullet"/>
+      <w:lvlText w:val=""/>
+      <w:lvlJc w:val="left"/>
+      <w:pPr>
+        <w:ind w:left="720" w:hanging="360"/>
+      </w:pPr>
+      <w:rPr>
+        <w:rFonts w:ascii="Symbol" w:eastAsiaTheme="minorHAnsi" w:hAnsi="Symbol" w:cstheme="minorBidi" w:hint="default"/>
+      </w:rPr>
+    </w:lvl>
+    <w:lvl w:ilvl="1" w:tplc="04090003">
+      <w:start w:val="1"/>
+      <w:numFmt w:val="bullet"/>
+      <w:lvlText w:val="o"/>
+      <w:lvlJc w:val="left"/>
+      <w:pPr>
+        <w:ind w:left="1440" w:hanging="360"/>
+      </w:pPr>
+      <w:rPr>
+        <w:rFonts w:ascii="Courier New" w:hAnsi="Courier New" w:cs="Courier New" w:hint="default"/>
+      </w:rPr>
+    </w:lvl>
+    <w:lvl w:ilvl="2" w:tplc="04090005" w:tentative="1">
+      <w:start w:val="1"/>
+      <w:numFmt w:val="bullet"/>
+      <w:lvlText w:val=""/>
+      <w:lvlJc w:val="left"/>
+      <w:pPr>
+        <w:ind w:left="2160" w:hanging="360"/>
+      </w:pPr>
+      <w:rPr>
+        <w:rFonts w:ascii="Wingdings" w:hAnsi="Wingdings" w:hint="default"/>
+      </w:rPr>
+    </w:lvl>
+    <w:lvl w:ilvl="3" w:tplc="04090001" w:tentative="1">
+      <w:start w:val="1"/>
+      <w:numFmt w:val="bullet"/>
+      <w:lvlText w:val=""/>
+      <w:lvlJc w:val="left"/>
+      <w:pPr>
+        <w:ind w:left="2880" w:hanging="360"/>
+      </w:pPr>
+      <w:rPr>
+        <w:rFonts w:ascii="Symbol" w:hAnsi="Symbol" w:hint="default"/>
+      </w:rPr>
+    </w:lvl>
+    <w:lvl w:ilvl="4" w:tplc="04090003" w:tentative="1">
+      <w:start w:val="1"/>
+      <w:numFmt w:val="bullet"/>
+      <w:lvlText w:val="o"/>
+      <w:lvlJc w:val="left"/>
+      <w:pPr>
+        <w:ind w:left="3600" w:hanging="360"/>
+      </w:pPr>
+      <w:rPr>
+        <w:rFonts w:ascii="Courier New" w:hAnsi="Courier New" w:cs="Courier New" w:hint="default"/>
+      </w:rPr>
+    </w:lvl>
+    <w:lvl w:ilvl="5" w:tplc="04090005" w:tentative="1">
+      <w:start w:val="1"/>
+      <w:numFmt w:val="bullet"/>
+      <w:lvlText w:val=""/>
+      <w:lvlJc w:val="left"/>
+      <w:pPr>
+        <w:ind w:left="4320" w:hanging="360"/>
+      </w:pPr>
+      <w:rPr>
+        <w:rFonts w:ascii="Wingdings" w:hAnsi="Wingdings" w:hint="default"/>
+      </w:rPr>
+    </w:lvl>
+    <w:lvl w:ilvl="6" w:tplc="04090001" w:tentative="1">
+      <w:start w:val="1"/>
+      <w:numFmt w:val="bullet"/>
+      <w:lvlText w:val=""/>
+      <w:lvlJc w:val="left"/>
+      <w:pPr>
+        <w:ind w:left="5040" w:hanging="360"/>
+      </w:pPr>
+      <w:rPr>
+        <w:rFonts w:ascii="Symbol" w:hAnsi="Symbol" w:hint="default"/>
+      </w:rPr>
+    </w:lvl>
+    <w:lvl w:ilvl="7" w:tplc="04090003" w:tentative="1">
+      <w:start w:val="1"/>
+      <w:numFmt w:val="bullet"/>
+      <w:lvlText w:val="o"/>
+      <w:lvlJc w:val="left"/>
+      <w:pPr>
+        <w:ind w:left="5760" w:hanging="360"/>
+      </w:pPr>
+      <w:rPr>
+        <w:rFonts w:ascii="Courier New" w:hAnsi="Courier New" w:cs="Courier New" w:hint="default"/>
+      </w:rPr>
+    </w:lvl>
+    <w:lvl w:ilvl="8" w:tplc="04090005" w:tentative="1">
+      <w:start w:val="1"/>
+      <w:numFmt w:val="bullet"/>
+      <w:lvlText w:val=""/>
+      <w:lvlJc w:val="left"/>
+      <w:pPr>
+        <w:ind w:left="6480" w:hanging="360"/>
+      </w:pPr>
+      <w:rPr>
+        <w:rFonts w:ascii="Wingdings" w:hAnsi="Wingdings" w:hint="default"/>
+      </w:rPr>
+    </w:lvl>
+  </w:abstractNum>
   <w:num w:numId="1" w16cid:durableId="1491170827">
     <w:abstractNumId w:val="0"/>
+  </w:num>
+  <w:num w:numId="2" w16cid:durableId="854032191">
+    <w:abstractNumId w:val="1"/>
   </w:num>
 </w:numbering>
 </file>

</xml_diff>